<commit_message>
Trim Step 5 reflection to ~240 words (200-250 target)
</commit_message>
<xml_diff>
--- a/Week 7/ALY3510_MatthewNaughton_Week7_Fall_2026.docx
+++ b/Week 7/ALY3510_MatthewNaughton_Week7_Fall_2026.docx
@@ -989,7 +989,7 @@
           <w:b w:val="0"/>
           <w:i w:val="0"/>
         </w:rPr>
-        <w:t>Running the reviews through Claude and then comparing the results with Naive Bayes made the difference between the two approaches easier for me to see. With Naive Bayes, the process is statistical. Words become evidence for either a positive or negative classification based on patterns learned from labeled examples. That makes the process fairly easy to follow, but some of the meaning can get lost when words are separated from the sentences around them.</w:t>
+        <w:t>Running the reviews through Claude and then comparing the results with Naive Bayes made the difference between the two approaches easier to see. Naive Bayes is statistical: words become evidence for a positive or negative classification based on patterns learned from labeled examples. That is easy to follow, but meaning can get lost when words are separated from the sentences around them.</w:t>
       </w:r>
     </w:p>
     <w:p>
@@ -1002,7 +1002,7 @@
           <w:b w:val="0"/>
           <w:i w:val="0"/>
         </w:rPr>
-        <w:t>The ambiguous review showed where that becomes important. When I changed the ending to “I’m keeping them,” Claude moved the review to positive even though much of the original wording stayed the same. It also handled “isn’t nearly as bad” as a positive statement even though the word “bad” was still there. A basic bag-of-words approach would have a harder time making those distinctions because word order and context are limited.</w:t>
+        <w:t>The ambiguous review showed why that matters. When I changed the ending to “I’m keeping them,” Claude moved the review to positive even though most of the original wording stayed the same. It also read “isn’t nearly as bad” as positive even though the word “bad” was still there. A bag-of-words approach would struggle with both, because word order and context are limited.</w:t>
       </w:r>
     </w:p>
     <w:p>
@@ -1015,7 +1015,7 @@
           <w:b w:val="0"/>
           <w:i w:val="0"/>
         </w:rPr>
-        <w:t>Claude did a better job with the way I would normally read these reviews, but there is a tradeoff. I can trace a Naive Bayes classification back to the probabilities associated with individual words. Claude can explain why it classified something a certain way, but that explanation does not give me the same visibility into how the model actually reached the result.</w:t>
+        <w:t>Claude read the reviews more like I would, but there is a tradeoff. I can trace a Naive Bayes result back to the probabilities tied to individual words. Claude can explain its reasoning, but that explanation is not the same as seeing how the model actually reached the result.</w:t>
       </w:r>
     </w:p>
     <w:p>
@@ -1028,7 +1028,7 @@
           <w:b w:val="0"/>
           <w:i w:val="0"/>
         </w:rPr>
-        <w:t>That distinction matters to me professionally. In facilities work, I usually want to be able to trace a result back to the information that caused it. For something low-risk, Claude’s ability to handle context could be useful. If the classification were being used to prioritize work or make a more important decision, I would want some way to verify the result rather than relying on the classification by itself.</w:t>
+        <w:t>That distinction matters to me professionally. In facilities work, I want to trace a result back to what caused it. For something low-risk, Claude’s feel for context is useful. But if a classification were used to prioritize work or support a bigger decision, I would want a way to verify it rather than trust the label on its own.</w:t>
       </w:r>
     </w:p>
     <w:p>

</xml_diff>